<commit_message>
Paper D: land tenure, informality and flood exposure along Kampala's channels; park satellite and tool papers
Co-Authored-By: Claude Opus 5.5 <noreply@anthropic.com>
</commit_message>
<xml_diff>
--- a/paper/kampala_drainage_research_programme.docx
+++ b/paper/kampala_drainage_research_programme.docx
@@ -1008,18 +1008,31 @@
               <w:pStyle w:val="Compact"/>
             </w:pPr>
             <w:r>
-              <w:t xml:space="preserve">Exposure 36k (1975) to 205k (2020); shift to low ground 1975-2000 only</w:t>
-            </w:r>
-          </w:p>
-        </w:tc>
-        <w:tc>
-          <w:tcPr/>
-          <w:p>
-            <w:pPr>
-              <w:pStyle w:val="Compact"/>
-            </w:pPr>
-            <w:r>
-              <w:t xml:space="preserve">Can merge into A, or stand alone with a tenure/land-market section</w:t>
+              <w:t xml:space="preserve">Exposure 36k (1975) to 205k (2020); exposure now growing fastest on the fringe; smaller building grain on low ground</w:t>
+            </w:r>
+          </w:p>
+        </w:tc>
+        <w:tc>
+          <w:tcPr/>
+          <w:p>
+            <w:pPr>
+              <w:pStyle w:val="Compact"/>
+            </w:pPr>
+            <w:r>
+              <w:rPr>
+                <w:b/>
+                <w:bCs/>
+              </w:rPr>
+              <w:t xml:space="preserve">Drafted with land-tenure angle:</w:t>
+            </w:r>
+            <w:r>
+              <w:t xml:space="preserve"> </w:t>
+            </w:r>
+            <w:r>
+              <w:rPr>
+                <w:rStyle w:val="VerbatimChar"/>
+              </w:rPr>
+              <w:t xml:space="preserve">kampala_drainage_paperD.md</w:t>
             </w:r>
           </w:p>
         </w:tc>
@@ -1082,7 +1095,17 @@
               <w:pStyle w:val="Compact"/>
             </w:pPr>
             <w:r>
-              <w:t xml:space="preserve">Needs KCCA desilting dates</w:t>
+              <w:rPr>
+                <w:b/>
+                <w:bCs/>
+              </w:rPr>
+              <w:t xml:space="preserve">Parked</w:t>
+            </w:r>
+            <w:r>
+              <w:t xml:space="preserve"> </w:t>
+            </w:r>
+            <w:r>
+              <w:t xml:space="preserve">(needs KCCA desilting dates)</w:t>
             </w:r>
           </w:p>
         </w:tc>
@@ -1187,18 +1210,28 @@
               <w:pStyle w:val="Compact"/>
             </w:pPr>
             <w:r>
-              <w:t xml:space="preserve">Kampala Drain Watch published (map, work queue, shared field reports)</w:t>
-            </w:r>
-          </w:p>
-        </w:tc>
-        <w:tc>
-          <w:tcPr/>
-          <w:p>
-            <w:pPr>
-              <w:pStyle w:val="Compact"/>
-            </w:pPr>
-            <w:r>
-              <w:t xml:space="preserve">Pilot with KCCA division engineers</w:t>
+              <w:t xml:space="preserve">Kampala Drain Watch live (gavacharles.github.io/kampala-drain-watch)</w:t>
+            </w:r>
+          </w:p>
+        </w:tc>
+        <w:tc>
+          <w:tcPr/>
+          <w:p>
+            <w:pPr>
+              <w:pStyle w:val="Compact"/>
+            </w:pPr>
+            <w:r>
+              <w:rPr>
+                <w:b/>
+                <w:bCs/>
+              </w:rPr>
+              <w:t xml:space="preserve">Parked</w:t>
+            </w:r>
+            <w:r>
+              <w:t xml:space="preserve"> </w:t>
+            </w:r>
+            <w:r>
+              <w:t xml:space="preserve">as a paper; the tool stays live</w:t>
             </w:r>
           </w:p>
         </w:tc>

</xml_diff>

<commit_message>
Six follow-on Kampala papers: storage, access, damage, heat-flood, design drift, regional cities
Co-Authored-By: Claude Opus 5.5 <noreply@anthropic.com>
</commit_message>
<xml_diff>
--- a/paper/kampala_drainage_research_programme.docx
+++ b/paper/kampala_drainage_research_programme.docx
@@ -1267,7 +1267,420 @@
       </w:r>
     </w:p>
     <w:bookmarkEnd w:id="10"/>
-    <w:bookmarkStart w:id="15" w:name="shared-foundations-done"/>
+    <w:bookmarkStart w:id="11" w:name="follow-on-papers-october-2026"/>
+    <w:p>
+      <w:pPr>
+        <w:pStyle w:val="Heading1"/>
+      </w:pPr>
+      <w:r>
+        <w:t xml:space="preserve">Follow-on papers (October 2026)</w:t>
+      </w:r>
+    </w:p>
+    <w:tbl>
+      <w:tblPr>
+        <w:tblStyle w:val="Table"/>
+        <w:tblW w:type="pct" w:w="5000"/>
+        <w:tblLayout w:type="fixed"/>
+        <w:tblLook w:firstRow="1" w:lastRow="0" w:firstColumn="0" w:lastColumn="0" w:noHBand="0" w:noVBand="0" w:val="0020"/>
+      </w:tblPr>
+      <w:tblGrid>
+        <w:gridCol w:w="1980"/>
+        <w:gridCol w:w="1980"/>
+        <w:gridCol w:w="1980"/>
+        <w:gridCol w:w="1980"/>
+      </w:tblGrid>
+      <w:tr>
+        <w:trPr>
+          <w:tblHeader w:val="on"/>
+        </w:trPr>
+        <w:tc>
+          <w:tcPr/>
+          <w:p>
+            <w:pPr>
+              <w:pStyle w:val="Compact"/>
+            </w:pPr>
+            <w:r>
+              <w:t xml:space="preserve">#</w:t>
+            </w:r>
+          </w:p>
+        </w:tc>
+        <w:tc>
+          <w:tcPr/>
+          <w:p>
+            <w:pPr>
+              <w:pStyle w:val="Compact"/>
+            </w:pPr>
+            <w:r>
+              <w:t xml:space="preserve">Paper</w:t>
+            </w:r>
+          </w:p>
+        </w:tc>
+        <w:tc>
+          <w:tcPr/>
+          <w:p>
+            <w:pPr>
+              <w:pStyle w:val="Compact"/>
+            </w:pPr>
+            <w:r>
+              <w:t xml:space="preserve">Key result</w:t>
+            </w:r>
+          </w:p>
+        </w:tc>
+        <w:tc>
+          <w:tcPr/>
+          <w:p>
+            <w:pPr>
+              <w:pStyle w:val="Compact"/>
+            </w:pPr>
+            <w:r>
+              <w:t xml:space="preserve">File</w:t>
+            </w:r>
+          </w:p>
+        </w:tc>
+      </w:tr>
+      <w:tr>
+        <w:tc>
+          <w:tcPr/>
+          <w:p>
+            <w:pPr>
+              <w:pStyle w:val="Compact"/>
+            </w:pPr>
+            <w:r>
+              <w:t xml:space="preserve">1</w:t>
+            </w:r>
+          </w:p>
+        </w:tc>
+        <w:tc>
+          <w:tcPr/>
+          <w:p>
+            <w:pPr>
+              <w:pStyle w:val="Compact"/>
+            </w:pPr>
+            <w:r>
+              <w:t xml:space="preserve">The lost sponge: valley-floor flood storage 1975-2030</w:t>
+            </w:r>
+          </w:p>
+        </w:tc>
+        <w:tc>
+          <w:tcPr/>
+          <w:p>
+            <w:pPr>
+              <w:pStyle w:val="Compact"/>
+            </w:pPr>
+            <w:r>
+              <w:t xml:space="preserve">8.5 Mm³ storage paved over; living wetland sponge -73% to -91% in Kinawataka and Nalukolongo; most systems went from holding to failing a 10-yr storm</w:t>
+            </w:r>
+          </w:p>
+        </w:tc>
+        <w:tc>
+          <w:tcPr/>
+          <w:p>
+            <w:pPr>
+              <w:pStyle w:val="Compact"/>
+            </w:pPr>
+            <w:r>
+              <w:rPr>
+                <w:rStyle w:val="VerbatimChar"/>
+              </w:rPr>
+              <w:t xml:space="preserve">kampala_sponge_paper1.md</w:t>
+            </w:r>
+          </w:p>
+        </w:tc>
+      </w:tr>
+      <w:tr>
+        <w:tc>
+          <w:tcPr/>
+          <w:p>
+            <w:pPr>
+              <w:pStyle w:val="Compact"/>
+            </w:pPr>
+            <w:r>
+              <w:t xml:space="preserve">3</w:t>
+            </w:r>
+          </w:p>
+        </w:tc>
+        <w:tc>
+          <w:tcPr/>
+          <w:p>
+            <w:pPr>
+              <w:pStyle w:val="Compact"/>
+            </w:pPr>
+            <w:r>
+              <w:t xml:space="preserve">Cut off by water: hospital and school access</w:t>
+            </w:r>
+          </w:p>
+        </w:tc>
+        <w:tc>
+          <w:tcPr/>
+          <w:p>
+            <w:pPr>
+              <w:pStyle w:val="Compact"/>
+            </w:pPr>
+            <w:r>
+              <w:t xml:space="preserve">1 m flood: 36,000 dry-home residents lose all routes to hospital, 131,000 see trips double; Busega A5 and Lubigi roads most critical</w:t>
+            </w:r>
+          </w:p>
+        </w:tc>
+        <w:tc>
+          <w:tcPr/>
+          <w:p>
+            <w:pPr>
+              <w:pStyle w:val="Compact"/>
+            </w:pPr>
+            <w:r>
+              <w:rPr>
+                <w:rStyle w:val="VerbatimChar"/>
+              </w:rPr>
+              <w:t xml:space="preserve">kampala_access_paper3.md</w:t>
+            </w:r>
+          </w:p>
+        </w:tc>
+      </w:tr>
+      <w:tr>
+        <w:tc>
+          <w:tcPr/>
+          <w:p>
+            <w:pPr>
+              <w:pStyle w:val="Compact"/>
+            </w:pPr>
+            <w:r>
+              <w:t xml:space="preserve">4</w:t>
+            </w:r>
+          </w:p>
+        </w:tc>
+        <w:tc>
+          <w:tcPr/>
+          <w:p>
+            <w:pPr>
+              <w:pStyle w:val="Compact"/>
+            </w:pPr>
+            <w:r>
+              <w:t xml:space="preserve">The cost of a blocked drain</w:t>
+            </w:r>
+          </w:p>
+        </w:tc>
+        <w:tc>
+          <w:tcPr/>
+          <w:p>
+            <w:pPr>
+              <w:pStyle w:val="Compact"/>
+            </w:pPr>
+            <w:r>
+              <w:t xml:space="preserve">EAD US$3.0m clean vs US$20.3m silted; maintenance worth ~US$17m/yr; Nakivubo and lower Lubigi most valuable to keep clear</w:t>
+            </w:r>
+          </w:p>
+        </w:tc>
+        <w:tc>
+          <w:tcPr/>
+          <w:p>
+            <w:pPr>
+              <w:pStyle w:val="Compact"/>
+            </w:pPr>
+            <w:r>
+              <w:rPr>
+                <w:rStyle w:val="VerbatimChar"/>
+              </w:rPr>
+              <w:t xml:space="preserve">kampala_damage_paper4.md</w:t>
+            </w:r>
+          </w:p>
+        </w:tc>
+      </w:tr>
+      <w:tr>
+        <w:tc>
+          <w:tcPr/>
+          <w:p>
+            <w:pPr>
+              <w:pStyle w:val="Compact"/>
+            </w:pPr>
+            <w:r>
+              <w:t xml:space="preserve">5</w:t>
+            </w:r>
+          </w:p>
+        </w:tc>
+        <w:tc>
+          <w:tcPr/>
+          <w:p>
+            <w:pPr>
+              <w:pStyle w:val="Compact"/>
+            </w:pPr>
+            <w:r>
+              <w:t xml:space="preserve">Double exposure: heat and flood</w:t>
+            </w:r>
+          </w:p>
+        </w:tc>
+        <w:tc>
+          <w:tcPr/>
+          <w:p>
+            <w:pPr>
+              <w:pStyle w:val="Compact"/>
+            </w:pPr>
+            <w:r>
+              <w:t xml:space="preserve">53% of low-ground residents in the warmest 20% of nights vs 29% on hills (OR 2.7); low ground +0.33 °C at night after controls</w:t>
+            </w:r>
+          </w:p>
+        </w:tc>
+        <w:tc>
+          <w:tcPr/>
+          <w:p>
+            <w:pPr>
+              <w:pStyle w:val="Compact"/>
+            </w:pPr>
+            <w:r>
+              <w:rPr>
+                <w:rStyle w:val="VerbatimChar"/>
+              </w:rPr>
+              <w:t xml:space="preserve">kampala_heat_flood_paper5.md</w:t>
+            </w:r>
+          </w:p>
+        </w:tc>
+      </w:tr>
+      <w:tr>
+        <w:tc>
+          <w:tcPr/>
+          <w:p>
+            <w:pPr>
+              <w:pStyle w:val="Compact"/>
+            </w:pPr>
+            <w:r>
+              <w:t xml:space="preserve">6</w:t>
+            </w:r>
+          </w:p>
+        </w:tc>
+        <w:tc>
+          <w:tcPr/>
+          <w:p>
+            <w:pPr>
+              <w:pStyle w:val="Compact"/>
+            </w:pPr>
+            <w:r>
+              <w:t xml:space="preserve">Design-basis drift</w:t>
+            </w:r>
+          </w:p>
+        </w:tc>
+        <w:tc>
+          <w:tcPr/>
+          <w:p>
+            <w:pPr>
+              <w:pStyle w:val="Compact"/>
+            </w:pPr>
+            <w:r>
+              <w:t xml:space="preserve">Channels sized for 1990 now get +17% (median) 10-yr flow; 91% of length overloaded &gt;20% under 2041-70 SSP5-8.5; drift is a fringe, not a hotspot, phenomenon</w:t>
+            </w:r>
+          </w:p>
+        </w:tc>
+        <w:tc>
+          <w:tcPr/>
+          <w:p>
+            <w:pPr>
+              <w:pStyle w:val="Compact"/>
+            </w:pPr>
+            <w:r>
+              <w:rPr>
+                <w:rStyle w:val="VerbatimChar"/>
+              </w:rPr>
+              <w:t xml:space="preserve">kampala_capacity_paper6.md</w:t>
+            </w:r>
+          </w:p>
+        </w:tc>
+      </w:tr>
+      <w:tr>
+        <w:tc>
+          <w:tcPr/>
+          <w:p>
+            <w:pPr>
+              <w:pStyle w:val="Compact"/>
+            </w:pPr>
+            <w:r>
+              <w:t xml:space="preserve">7</w:t>
+            </w:r>
+          </w:p>
+        </w:tc>
+        <w:tc>
+          <w:tcPr/>
+          <w:p>
+            <w:pPr>
+              <w:pStyle w:val="Compact"/>
+            </w:pPr>
+            <w:r>
+              <w:t xml:space="preserve">The next Kampalas: regional cities</w:t>
+            </w:r>
+          </w:p>
+        </w:tc>
+        <w:tc>
+          <w:tcPr/>
+          <w:p>
+            <w:pPr>
+              <w:pStyle w:val="Compact"/>
+            </w:pPr>
+            <w:r>
+              <w:t xml:space="preserve">Low ground filling 1.3-2x faster than the city in Mbarara, Gulu, Mbale, Jinja, Arua (2020-30)</w:t>
+            </w:r>
+          </w:p>
+        </w:tc>
+        <w:tc>
+          <w:tcPr/>
+          <w:p>
+            <w:pPr>
+              <w:pStyle w:val="Compact"/>
+            </w:pPr>
+            <w:r>
+              <w:rPr>
+                <w:rStyle w:val="VerbatimChar"/>
+              </w:rPr>
+              <w:t xml:space="preserve">uganda_cities_paper7.md</w:t>
+            </w:r>
+          </w:p>
+        </w:tc>
+      </w:tr>
+      <w:tr>
+        <w:tc>
+          <w:tcPr/>
+          <w:p>
+            <w:pPr>
+              <w:pStyle w:val="Compact"/>
+            </w:pPr>
+            <w:r>
+              <w:t xml:space="preserve">2</w:t>
+            </w:r>
+          </w:p>
+        </w:tc>
+        <w:tc>
+          <w:tcPr/>
+          <w:p>
+            <w:pPr>
+              <w:pStyle w:val="Compact"/>
+            </w:pPr>
+            <w:r>
+              <w:t xml:space="preserve">Drains to the tap (Lake Victoria water quality)</w:t>
+            </w:r>
+          </w:p>
+        </w:tc>
+        <w:tc>
+          <w:tcPr/>
+          <w:p>
+            <w:pPr>
+              <w:pStyle w:val="Compact"/>
+            </w:pPr>
+            <w:r>
+              <w:t xml:space="preserve">Not started; needs NWSC raw-water data</w:t>
+            </w:r>
+          </w:p>
+        </w:tc>
+        <w:tc>
+          <w:tcPr/>
+          <w:p>
+            <w:pPr>
+              <w:pStyle w:val="Compact"/>
+            </w:pPr>
+            <w:r>
+              <w:t xml:space="preserve">-</w:t>
+            </w:r>
+          </w:p>
+        </w:tc>
+      </w:tr>
+    </w:tbl>
+    <w:bookmarkEnd w:id="11"/>
+    <w:bookmarkStart w:id="16" w:name="shared-foundations-done"/>
     <w:p>
       <w:pPr>
         <w:pStyle w:val="Heading1"/>
@@ -1287,7 +1700,7 @@
       <w:r>
         <w:t xml:space="preserve">12,453 channel segments (≈ 900 km) with upstream area, paving 1990/2020, culverts, bridges, waste points, markets, buildings within 15 m, floodplain buildings, wetland left, valley-floor building (</w:t>
       </w:r>
-      <w:hyperlink r:id="rId11">
+      <w:hyperlink r:id="rId12">
         <w:r>
           <w:rPr>
             <w:rStyle w:val="VerbatimChar"/>
@@ -1322,7 +1735,7 @@
       <w:r>
         <w:t xml:space="preserve">Rainfall and temperature for Greater Kampala 1981-2025 (</w:t>
       </w:r>
-      <w:hyperlink r:id="rId12">
+      <w:hyperlink r:id="rId13">
         <w:r>
           <w:rPr>
             <w:rStyle w:val="VerbatimChar"/>
@@ -1345,7 +1758,7 @@
       <w:r>
         <w:t xml:space="preserve">Satellite layers: Landsat 1986-2025, Impact Observatory land cover 2017-2023, Sentinel-1 2017-2026, Sentinel-2 2026 (</w:t>
       </w:r>
-      <w:hyperlink r:id="rId13">
+      <w:hyperlink r:id="rId14">
         <w:r>
           <w:rPr>
             <w:rStyle w:val="VerbatimChar"/>
@@ -1359,7 +1772,7 @@
       <w:r>
         <w:t xml:space="preserve"> </w:t>
       </w:r>
-      <w:hyperlink r:id="rId14">
+      <w:hyperlink r:id="rId15">
         <w:r>
           <w:rPr>
             <w:rStyle w:val="VerbatimChar"/>
@@ -1395,8 +1808,8 @@
         <w:t xml:space="preserve">.</w:t>
       </w:r>
     </w:p>
-    <w:bookmarkEnd w:id="15"/>
-    <w:bookmarkStart w:id="16" w:name="X575737193ad0b043aad2c8ff395f2c6b1f51131"/>
+    <w:bookmarkEnd w:id="16"/>
+    <w:bookmarkStart w:id="17" w:name="X575737193ad0b043aad2c8ff395f2c6b1f51131"/>
     <w:p>
       <w:pPr>
         <w:pStyle w:val="Heading1"/>
@@ -1559,8 +1972,8 @@
         <w:t xml:space="preserve">Reporting bias (more news coverage now); satellite rain smooths storms (on 29-31 Oct 2025 the Makerere gauge recorded 63 mm vs 21 mm from CHIRPS). Mitigation: event-size classes, placebo days, sensitivity to the rain product, and any gauge data obtainable from UNMA/Makerere.</w:t>
       </w:r>
     </w:p>
-    <w:bookmarkEnd w:id="16"/>
-    <w:bookmarkStart w:id="17" w:name="Xc37a460c59ac393f2db109078f2ab4dbcd365ce"/>
+    <w:bookmarkEnd w:id="17"/>
+    <w:bookmarkStart w:id="18" w:name="Xc37a460c59ac393f2db109078f2ab4dbcd365ce"/>
     <w:p>
       <w:pPr>
         <w:pStyle w:val="Heading1"/>
@@ -1641,8 +2054,8 @@
         <w:t xml:space="preserve">Published Kampala wetland-loss work uses optical snapshots (Landsat, aerial photos). We found no Sentinel-1 time-series encroachment study for Kampala; the operational angle (yearly alerts per channel) is new.</w:t>
       </w:r>
     </w:p>
-    <w:bookmarkEnd w:id="17"/>
-    <w:bookmarkStart w:id="18" w:name="paper-c-waste-culverts-and-floods"/>
+    <w:bookmarkEnd w:id="18"/>
+    <w:bookmarkStart w:id="19" w:name="paper-c-waste-culverts-and-floods"/>
     <w:p>
       <w:pPr>
         <w:pStyle w:val="Heading1"/>
@@ -1718,8 +2131,8 @@
         <w:t xml:space="preserve">) modelled blockage at three Lubigi culverts, finding flood volumes up by 40-105%. We found no city-wide, open-data quantification linking dumping sites, culverts and reported floods.</w:t>
       </w:r>
     </w:p>
-    <w:bookmarkEnd w:id="18"/>
-    <w:bookmarkStart w:id="19" w:name="Xc5a448673d249510bf091ee8d11b4ce9d091bd3"/>
+    <w:bookmarkEnd w:id="19"/>
+    <w:bookmarkStart w:id="20" w:name="Xc5a448673d249510bf091ee8d11b4ce9d091bd3"/>
     <w:p>
       <w:pPr>
         <w:pStyle w:val="Heading1"/>
@@ -1800,8 +2213,8 @@
         <w:t xml:space="preserve">Earlier Kampala work simulated urban growth and flood exposure for the upper Lubigi to 2025-2030 (Pérez-Molina, Sliuzas &amp; Flacke). We found no city-wide, observed 1975-2030 channel-level exposure series.</w:t>
       </w:r>
     </w:p>
-    <w:bookmarkEnd w:id="19"/>
-    <w:bookmarkStart w:id="20" w:name="Xe25bd9916b2926ef2d2266614f6ff52f9b68372"/>
+    <w:bookmarkEnd w:id="20"/>
+    <w:bookmarkStart w:id="21" w:name="Xe25bd9916b2926ef2d2266614f6ff52f9b68372"/>
     <w:p>
       <w:pPr>
         <w:pStyle w:val="Heading1"/>
@@ -1876,8 +2289,8 @@
         <w:t xml:space="preserve">Sentinel-2 has been used for river and floodplain vegetation and agricultural ditches (e.g. Rhine/Meuse floodplains). We found no application to urban stormwater channels in Africa. Narrow channels (&lt; 10 m) are a resolution limit, to be stated plainly.</w:t>
       </w:r>
     </w:p>
-    <w:bookmarkEnd w:id="20"/>
-    <w:bookmarkStart w:id="21" w:name="d0-flood-catalogue-data-paper"/>
+    <w:bookmarkEnd w:id="21"/>
+    <w:bookmarkStart w:id="22" w:name="d0-flood-catalogue-data-paper"/>
     <w:p>
       <w:pPr>
         <w:pStyle w:val="Heading1"/>
@@ -1894,8 +2307,8 @@
         <w:t xml:space="preserve">Systematic search of Daily Monitor, New Vision, The Observer, NTV, Nile Post, ChimpReports, Uganda Radio Network, ReliefWeb, FloodList, Uganda Red Cross and KCCA statements, 2000-2026. Record date, time, places, channel, deaths, roads closed, source. Geocode with an uncertainty radius. Publish openly; the dashboard’s field reports extend it.</w:t>
       </w:r>
     </w:p>
-    <w:bookmarkEnd w:id="21"/>
-    <w:bookmarkStart w:id="22" w:name="t-the-tool"/>
+    <w:bookmarkEnd w:id="22"/>
+    <w:bookmarkStart w:id="23" w:name="t-the-tool"/>
     <w:p>
       <w:pPr>
         <w:pStyle w:val="Heading1"/>
@@ -1944,8 +2357,8 @@
         <w:t xml:space="preserve">once in use.</w:t>
       </w:r>
     </w:p>
-    <w:bookmarkEnd w:id="22"/>
-    <w:bookmarkStart w:id="23" w:name="order-of-work"/>
+    <w:bookmarkEnd w:id="23"/>
+    <w:bookmarkStart w:id="24" w:name="order-of-work"/>
     <w:p>
       <w:pPr>
         <w:pStyle w:val="Heading1"/>
@@ -2026,8 +2439,8 @@
         <w:t xml:space="preserve">T dashboard, built alongside, then the software paper.</w:t>
       </w:r>
     </w:p>
-    <w:bookmarkEnd w:id="23"/>
-    <w:bookmarkStart w:id="24" w:name="Xdd7ab56424fbfc0bc4618ea4fcb3a101f25f606"/>
+    <w:bookmarkEnd w:id="24"/>
+    <w:bookmarkStart w:id="25" w:name="Xdd7ab56424fbfc0bc4618ea4fcb3a101f25f606"/>
     <w:p>
       <w:pPr>
         <w:pStyle w:val="Heading1"/>
@@ -2133,7 +2546,7 @@
         <w:t xml:space="preserve">UBOS rapid assessment of the March 2025 GKMA floods.</w:t>
       </w:r>
     </w:p>
-    <w:bookmarkEnd w:id="24"/>
+    <w:bookmarkEnd w:id="25"/>
     <w:sectPr>
       <w:footnotePr>
         <w:numRestart w:val="eachSect"/>

</xml_diff>

<commit_message>
Paper 2 (wetland loss and Murchison Bay from Sentinel-2/Landsat) and two Substack drafts: flood log, the sponge we paved
Co-Authored-By: Claude Opus 5.5 <noreply@anthropic.com>
</commit_message>
<xml_diff>
--- a/paper/kampala_drainage_research_programme.docx
+++ b/paper/kampala_drainage_research_programme.docx
@@ -1669,29 +1669,55 @@
               <w:pStyle w:val="Compact"/>
             </w:pPr>
             <w:r>
-              <w:t xml:space="preserve">Drains to the tap (Lake Victoria water quality)</w:t>
-            </w:r>
-          </w:p>
-        </w:tc>
-        <w:tc>
-          <w:tcPr/>
-          <w:p>
-            <w:pPr>
-              <w:pStyle w:val="Compact"/>
-            </w:pPr>
-            <w:r>
-              <w:t xml:space="preserve">Not started; needs NWSC raw-water data</w:t>
-            </w:r>
-          </w:p>
-        </w:tc>
-        <w:tc>
-          <w:tcPr/>
-          <w:p>
-            <w:pPr>
-              <w:pStyle w:val="Compact"/>
-            </w:pPr>
-            <w:r>
-              <w:t xml:space="preserve">-</w:t>
+              <w:t xml:space="preserve">The lost free treatment plant: wetland loss and Inner Murchison Bay, 1986-2026 (satellite only, no NWSC data)</w:t>
+            </w:r>
+          </w:p>
+        </w:tc>
+        <w:tc>
+          <w:tcPr/>
+          <w:p>
+            <w:pPr>
+              <w:pStyle w:val="Compact"/>
+            </w:pPr>
+            <w:r>
+              <w:t xml:space="preserve">Drafted: bay-draining wetland -51% (1,200 to 587 ha); outlet/lake turbidity ratio 1.14 to 1.51; +5.3% per 100 ha lost (p = 0.019);</w:t>
+            </w:r>
+            <w:r>
+              <w:t xml:space="preserve"> </w:t>
+            </w:r>
+            <w:r>
+              <w:rPr>
+                <w:rStyle w:val="VerbatimChar"/>
+              </w:rPr>
+              <w:t xml:space="preserve">kampala_bay_paper2.md</w:t>
+            </w:r>
+          </w:p>
+        </w:tc>
+        <w:tc>
+          <w:tcPr/>
+          <w:p>
+            <w:pPr>
+              <w:pStyle w:val="Compact"/>
+            </w:pPr>
+            <w:r>
+              <w:rPr>
+                <w:i/>
+                <w:iCs/>
+              </w:rPr>
+              <w:t xml:space="preserve">Science of the Total Environment</w:t>
+            </w:r>
+            <w:r>
+              <w:t xml:space="preserve">;</w:t>
+            </w:r>
+            <w:r>
+              <w:t xml:space="preserve"> </w:t>
+            </w:r>
+            <w:r>
+              <w:rPr>
+                <w:i/>
+                <w:iCs/>
+              </w:rPr>
+              <w:t xml:space="preserve">J. Great Lakes Research</w:t>
             </w:r>
           </w:p>
         </w:tc>

</xml_diff>

<commit_message>
Paper R: attribution of Kampala road flood disruption (16 factorial scenarios, Shapley, network access, crossing ranking, silt sensitivity)
Co-Authored-By: Claude Opus 5.5 <noreply@anthropic.com>
</commit_message>
<xml_diff>
--- a/paper/kampala_drainage_research_programme.docx
+++ b/paper/kampala_drainage_research_programme.docx
@@ -1718,6 +1718,78 @@
                 <w:iCs/>
               </w:rPr>
               <w:t xml:space="preserve">J. Great Lakes Research</w:t>
+            </w:r>
+          </w:p>
+        </w:tc>
+      </w:tr>
+      <w:tr>
+        <w:tc>
+          <w:tcPr/>
+          <w:p>
+            <w:pPr>
+              <w:pStyle w:val="Compact"/>
+            </w:pPr>
+            <w:r>
+              <w:t xml:space="preserve">R</w:t>
+            </w:r>
+          </w:p>
+        </w:tc>
+        <w:tc>
+          <w:tcPr/>
+          <w:p>
+            <w:pPr>
+              <w:pStyle w:val="Compact"/>
+            </w:pPr>
+            <w:r>
+              <w:t xml:space="preserve">Silt, not storms: attributing flood disruption of Kampala’s road network (factorial scenarios, Shapley)</w:t>
+            </w:r>
+          </w:p>
+        </w:tc>
+        <w:tc>
+          <w:tcPr/>
+          <w:p>
+            <w:pPr>
+              <w:pStyle w:val="Compact"/>
+            </w:pPr>
+            <w:r>
+              <w:t xml:space="preserve">Drafted: siltation 83% of the rise in impassable road-km, 86% of people cut off;</w:t>
+            </w:r>
+            <w:r>
+              <w:t xml:space="preserve"> </w:t>
+            </w:r>
+            <w:r>
+              <w:rPr>
+                <w:rStyle w:val="VerbatimChar"/>
+              </w:rPr>
+              <w:t xml:space="preserve">kampala_roads_attribution_paperR.md</w:t>
+            </w:r>
+          </w:p>
+        </w:tc>
+        <w:tc>
+          <w:tcPr/>
+          <w:p>
+            <w:pPr>
+              <w:pStyle w:val="Compact"/>
+            </w:pPr>
+            <w:r>
+              <w:rPr>
+                <w:i/>
+                <w:iCs/>
+              </w:rPr>
+              <w:t xml:space="preserve">Transportation Research Part D</w:t>
+            </w:r>
+            <w:r>
+              <w:t xml:space="preserve">;</w:t>
+            </w:r>
+            <w:r>
+              <w:t xml:space="preserve"> </w:t>
+            </w:r>
+            <w:r>
+              <w:rPr>
+                <w:i/>
+                <w:iCs/>
+              </w:rPr>
+              <w:t xml:space="preserve">NHESS</w:t>
             </w:r>
           </w:p>
         </w:tc>

</xml_diff>